<commit_message>
docs(user-guide): v0.3 align G-149..G-153 status with the fix branch, rebuild packages
G-149..G-151 verified fixed on fix/uat-g128-g149-g152 (not yet on main);
G-152 partly fixed; G-153 has no code change and needs an owner decision;
G-128 records the requester but deliberately does not block self-approval.
Not re-tested.

Co-Authored-By: Claude Sonnet 5.5 <noreply@anthropic.com>
Claude-Session: https://claude.ai/code/session_01WczFPvaa8k4oaBj6Ax5jZL
</commit_message>
<xml_diff>
--- a/docs/user-guide/hydromart-panduan-pelanggan.docx
+++ b/docs/user-guide/hydromart-panduan-pelanggan.docx
@@ -15,7 +15,7 @@
         <w:pStyle w:val="Subtitle"/>
       </w:pPr>
       <w:r>
-        <w:t xml:space="preserve">Versi 0.2 (draf) · 2026-10-14 · Klasifikasi: Publik / Pelanggan</w:t>
+        <w:t xml:space="preserve">Versi 0.3 (draf) · 2026-10-14 · Klasifikasi: Publik / Pelanggan</w:t>
       </w:r>
     </w:p>
     <w:sdt>
@@ -2539,7 +2539,23 @@
               <w:t xml:space="preserve"> </w:t>
             </w:r>
             <w:r>
-              <w:t xml:space="preserve">Akun yang sudah dihapus tidak mendapat pesan ini: uji 2026-10-14 menunjukkan login dengan nomor akun terhapus dijawab seolah nomor itu belum terdaftar (OTP pendaftaran), lihat G-153</w:t>
+              <w:t xml:space="preserve">Akun yang sudah dihapus tidak mendapat pesan ini: uji 2026-10-14 menunjukkan login dengan nomor akun terhapus dijawab seolah nomor itu belum terdaftar (OTP pendaftaran), lihat G-153.</w:t>
+            </w:r>
+            <w:r>
+              <w:t xml:space="preserve"> </w:t>
+            </w:r>
+            <w:r>
+              <w:rPr>
+                <w:bCs/>
+                <w:b/>
+              </w:rPr>
+              <w:t xml:space="preserve">[K]</w:t>
+            </w:r>
+            <w:r>
+              <w:t xml:space="preserve"> </w:t>
+            </w:r>
+            <w:r>
+              <w:t xml:space="preserve">Status 2026-10-14: diklaim selesai oleh pemilik produk, tetapi tidak ditemukan perubahan kode; kemungkinan perilaku sengaja (nomor dibebaskan saat penghapusan akun), perlu konfirmasi</w:t>
             </w:r>
           </w:p>
         </w:tc>
@@ -6583,6 +6599,65 @@
         </w:rPr>
         <w:t xml:space="preserve">. Ini beranda setelah masuk, bukan tampilan tamu. Lingkungan uji lokal, 2026-10-11.</w:t>
       </w:r>
+      <w:r>
+        <w:rPr>
+          <w:iCs/>
+          <w:i/>
+        </w:rPr>
+        <w:t xml:space="preserve"> </w:t>
+      </w:r>
+      <w:r>
+        <w:rPr>
+          <w:bCs/>
+          <w:b/>
+          <w:iCs/>
+          <w:i/>
+        </w:rPr>
+        <w:t xml:space="preserve">Catatan v0.3:</w:t>
+      </w:r>
+      <w:r>
+        <w:rPr>
+          <w:iCs/>
+          <w:i/>
+        </w:rPr>
+        <w:t xml:space="preserve"> </w:t>
+      </w:r>
+      <w:r>
+        <w:rPr>
+          <w:iCs/>
+          <w:i/>
+        </w:rPr>
+        <w:t xml:space="preserve">gambar ini diambil sebelum #666 (hero beranda kini memakai foto nyata, tombol "Beli lagi" berfungsi, chip terbaca); tampilan beranda di</w:t>
+      </w:r>
+      <w:r>
+        <w:rPr>
+          <w:iCs/>
+          <w:i/>
+        </w:rPr>
+        <w:t xml:space="preserve"> </w:t>
+      </w:r>
+      <w:r>
+        <w:rPr>
+          <w:rStyle w:val="VerbatimChar"/>
+          <w:iCs/>
+          <w:i/>
+        </w:rPr>
+        <w:t xml:space="preserve">main</w:t>
+      </w:r>
+      <w:r>
+        <w:rPr>
+          <w:iCs/>
+          <w:i/>
+        </w:rPr>
+        <w:t xml:space="preserve"> </w:t>
+      </w:r>
+      <w:r>
+        <w:rPr>
+          <w:iCs/>
+          <w:i/>
+        </w:rPr>
+        <w:t xml:space="preserve">sekarang berbeda dan gambar perlu diambil ulang.</w:t>
+      </w:r>
     </w:p>
     <w:p>
       <w:pPr>
@@ -21507,6 +21582,9 @@
                 <w:rStyle w:val="VerbatimChar"/>
               </w:rPr>
               <w:t xml:space="preserve">customer-01-beranda.png</w:t>
+            </w:r>
+            <w:r>
+              <w:t xml:space="preserve">. Perlu diambil ulang: gambar mendahului #666 (hero beranda berubah: foto nyata, "Beli lagi" berfungsi, chip terbaca)</w:t>
             </w:r>
           </w:p>
         </w:tc>
@@ -24020,7 +24098,7 @@
       <w:pStyle w:val="Header"/>
     </w:pPr>
     <w:r>
-      <w:t>Hydromart — Panduan Pengguna · Versi 0.2 (draf) · 2026-10-14</w:t>
+      <w:t>Hydromart — Panduan Pengguna · Versi 0.3 (draf) · 2026-10-14</w:t>
     </w:r>
   </w:p>
 </w:hdr>

</xml_diff>

<commit_message>
docs(user-guide): v0.4 align with fix-branch commit 609a497 (Finance read variants)
The fix branch adds four FINANCE read capabilities (106 -> 110) and keeps the
payout receipt across refetch. Documented as fixed on the branch, not yet on
main and not re-tested. Rebuilt the customer and internal packages.

Co-Authored-By: Claude Sonnet 5.5 <noreply@anthropic.com>
Claude-Session: https://claude.ai/code/session_01WczFPvaa8k4oaBj6Ax5jZL
</commit_message>
<xml_diff>
--- a/docs/user-guide/hydromart-panduan-pelanggan.docx
+++ b/docs/user-guide/hydromart-panduan-pelanggan.docx
@@ -15,7 +15,7 @@
         <w:pStyle w:val="Subtitle"/>
       </w:pPr>
       <w:r>
-        <w:t xml:space="preserve">Versi 0.3 (draf) · 2026-10-14 · Klasifikasi: Publik / Pelanggan</w:t>
+        <w:t xml:space="preserve">Versi 0.4 (draf) · 2026-10-14 · Klasifikasi: Publik / Pelanggan</w:t>
       </w:r>
     </w:p>
     <w:sdt>
@@ -24098,7 +24098,7 @@
       <w:pStyle w:val="Header"/>
     </w:pPr>
     <w:r>
-      <w:t>Hydromart — Panduan Pengguna · Versi 0.3 (draf) · 2026-10-14</w:t>
+      <w:t>Hydromart — Panduan Pengguna · Versi 0.4 (draf) · 2026-10-14</w:t>
     </w:r>
   </w:p>
 </w:hdr>

</xml_diff>